<commit_message>
refactor: reestructuración de assets y limpieza de archivos obsoletos
- Migración de archivos CSS a estructura modular en assets/css/
- Reorganización de estilos SCSS en assets/scss/
- Adición de filtros personalizados en _filters/
- Incorporación de scripts de automatización en scripts/
- Eliminación de archivos duplicados y obsoletos:
  - README.md, _metadata-pdf.lua, build.sh
  - assets/colors.scss, fonts.scss, styles.css
  - assets/listing-default.css, theme_dark.scss, theme_light.scss
- Actualización de configuración en _quarto.yml
- Mejora en partials title-block-link-buttons
- Actualización de metadatos en inteligencia-comercial y posts
- Adición de documentación interactiva en assets/interactions.html
- Inclusión de docs/ en el repositorio
</commit_message>
<xml_diff>
--- a/_site/r/2022-11-07-04-modelo-de-machine-learning-i-analisis-exploratorio/index.docx
+++ b/_site/r/2022-11-07-04-modelo-de-machine-learning-i-analisis-exploratorio/index.docx
@@ -44,7 +44,7 @@
         <w:t xml:space="preserve"> </w:t>
       </w:r>
     </w:p>
-    <w:bookmarkStart w:id="20" w:name="title"/>
+    <w:bookmarkStart w:id="22" w:name="title"/>
     <w:p>
       <w:pPr>
         <w:pStyle w:val="Heading1"/>
@@ -93,8 +93,8 @@
         <w:t xml:space="preserve"> </w:t>
       </w:r>
     </w:p>
-    <w:bookmarkEnd w:id="20"/>
-    <w:bookmarkStart w:id="24" w:name="author-note"/>
+    <w:bookmarkEnd w:id="22"/>
+    <w:bookmarkStart w:id="26" w:name="author-note"/>
     <w:p>
       <w:pPr>
         <w:pStyle w:val="Heading1"/>
@@ -113,15 +113,15 @@
       <w:r>
         <w:t xml:space="preserve"> </w:t>
       </w:r>
-      <w:bookmarkStart w:id="21" w:name="orchid"/>
+      <w:bookmarkStart w:id="23" w:name="orchid"/>
       <w:r>
         <w:t xml:space="preserve">Orcid ID Logo: A green circle with white letters ID</w:t>
       </w:r>
-      <w:bookmarkEnd w:id="21"/>
+      <w:bookmarkEnd w:id="23"/>
       <w:r>
         <w:t xml:space="preserve"> </w:t>
       </w:r>
-      <w:hyperlink r:id="rId22">
+      <w:hyperlink r:id="rId24">
         <w:r>
           <w:rPr>
             <w:rStyle w:val="Hyperlink"/>
@@ -160,7 +160,7 @@
         <w:t xml:space="preserve">: </w:t>
       </w:r>
       <w:r>
-        <w:t xml:space="preserve">conceptualización y redacción</w:t>
+        <w:t xml:space="preserve">conceptualización, metodología, análisis formal, investigación, recursos, curación de datos, redacción, visualización, supervisión, y administración del proyecto</w:t>
       </w:r>
     </w:p>
     <w:p>
@@ -168,12 +168,12 @@
         <w:pStyle w:val="BodyText"/>
       </w:pPr>
       <w:r>
-        <w:t xml:space="preserve">La correspondencia relativa a este artículo debe dirigirse a Edison Achalma, Escuela Profesional de Economía, Universidad Nacional de San Cristóbal de Huamanga, Ayacucho, AYA, Perú, Email:</w:t>
+        <w:t xml:space="preserve">La correspondencia relativa a este artículo debe dirigirse a Edison Achalma, Escuela Profesional de Economía, Universidad Nacional de San Cristóbal de Huamanga, Portal Independencia N° 57, Ayacucho, AYA 5001, Perú, Email:</w:t>
       </w:r>
       <w:r>
         <w:t xml:space="preserve"> </w:t>
       </w:r>
-      <w:hyperlink r:id="rId23">
+      <w:hyperlink r:id="rId25">
         <w:r>
           <w:rPr>
             <w:rStyle w:val="Hyperlink"/>
@@ -187,8 +187,8 @@
         <w:br w:type="page"/>
       </w:r>
     </w:p>
-    <w:bookmarkEnd w:id="24"/>
-    <w:bookmarkStart w:id="25" w:name="abstract"/>
+    <w:bookmarkEnd w:id="26"/>
+    <w:bookmarkStart w:id="27" w:name="abstract"/>
     <w:p>
       <w:pPr>
         <w:pStyle w:val="Heading1"/>
@@ -225,8 +225,8 @@
         <w:br w:type="page"/>
       </w:r>
     </w:p>
-    <w:bookmarkEnd w:id="25"/>
-    <w:bookmarkStart w:id="26" w:name="firstheader"/>
+    <w:bookmarkEnd w:id="27"/>
+    <w:bookmarkStart w:id="28" w:name="firstheader"/>
     <w:p>
       <w:pPr>
         <w:pStyle w:val="Heading1"/>
@@ -243,8 +243,8 @@
         <w:t xml:space="preserve">Este artículo está actualmente en proceso de edición, y todas las secciones serán ampliadas y refinadas en futuras revisiones.</w:t>
       </w:r>
     </w:p>
-    <w:bookmarkEnd w:id="26"/>
-    <w:bookmarkStart w:id="45" w:name="publicaciones-similares"/>
+    <w:bookmarkEnd w:id="28"/>
+    <w:bookmarkStart w:id="47" w:name="publicaciones-similares"/>
     <w:p>
       <w:pPr>
         <w:pStyle w:val="Heading1"/>
@@ -269,11 +269,11 @@
           <w:numId w:val="1001"/>
         </w:numPr>
       </w:pPr>
-      <w:hyperlink r:id="rId27"/>
+      <w:hyperlink r:id="rId29"/>
       <w:r>
         <w:t xml:space="preserve"> </w:t>
       </w:r>
-      <w:hyperlink r:id="rId28">
+      <w:hyperlink r:id="rId30">
         <w:r>
           <w:rPr>
             <w:rStyle w:val="Hyperlink"/>
@@ -290,11 +290,11 @@
           <w:numId w:val="1001"/>
         </w:numPr>
       </w:pPr>
-      <w:hyperlink r:id="rId29"/>
+      <w:hyperlink r:id="rId31"/>
       <w:r>
         <w:t xml:space="preserve"> </w:t>
       </w:r>
-      <w:hyperlink r:id="rId30">
+      <w:hyperlink r:id="rId32">
         <w:r>
           <w:rPr>
             <w:rStyle w:val="Hyperlink"/>
@@ -311,11 +311,11 @@
           <w:numId w:val="1001"/>
         </w:numPr>
       </w:pPr>
-      <w:hyperlink r:id="rId31"/>
+      <w:hyperlink r:id="rId33"/>
       <w:r>
         <w:t xml:space="preserve"> </w:t>
       </w:r>
-      <w:hyperlink r:id="rId32">
+      <w:hyperlink r:id="rId34">
         <w:r>
           <w:rPr>
             <w:rStyle w:val="Hyperlink"/>
@@ -332,11 +332,11 @@
           <w:numId w:val="1001"/>
         </w:numPr>
       </w:pPr>
-      <w:hyperlink r:id="rId33"/>
+      <w:hyperlink r:id="rId35"/>
       <w:r>
         <w:t xml:space="preserve"> </w:t>
       </w:r>
-      <w:hyperlink r:id="rId34">
+      <w:hyperlink r:id="rId36">
         <w:r>
           <w:rPr>
             <w:rStyle w:val="Hyperlink"/>
@@ -353,11 +353,11 @@
           <w:numId w:val="1001"/>
         </w:numPr>
       </w:pPr>
-      <w:hyperlink r:id="rId35"/>
+      <w:hyperlink r:id="rId37"/>
       <w:r>
         <w:t xml:space="preserve"> </w:t>
       </w:r>
-      <w:hyperlink r:id="rId36">
+      <w:hyperlink r:id="rId38">
         <w:r>
           <w:rPr>
             <w:rStyle w:val="Hyperlink"/>
@@ -374,11 +374,11 @@
           <w:numId w:val="1001"/>
         </w:numPr>
       </w:pPr>
-      <w:hyperlink r:id="rId37"/>
+      <w:hyperlink r:id="rId39"/>
       <w:r>
         <w:t xml:space="preserve"> </w:t>
       </w:r>
-      <w:hyperlink r:id="rId38">
+      <w:hyperlink r:id="rId40">
         <w:r>
           <w:rPr>
             <w:rStyle w:val="Hyperlink"/>
@@ -395,11 +395,11 @@
           <w:numId w:val="1001"/>
         </w:numPr>
       </w:pPr>
-      <w:hyperlink r:id="rId39"/>
+      <w:hyperlink r:id="rId41"/>
       <w:r>
         <w:t xml:space="preserve"> </w:t>
       </w:r>
-      <w:hyperlink r:id="rId40">
+      <w:hyperlink r:id="rId42">
         <w:r>
           <w:rPr>
             <w:rStyle w:val="Hyperlink"/>
@@ -416,11 +416,11 @@
           <w:numId w:val="1001"/>
         </w:numPr>
       </w:pPr>
-      <w:hyperlink r:id="rId41"/>
+      <w:hyperlink r:id="rId43"/>
       <w:r>
         <w:t xml:space="preserve"> </w:t>
       </w:r>
-      <w:hyperlink r:id="rId42">
+      <w:hyperlink r:id="rId44">
         <w:r>
           <w:rPr>
             <w:rStyle w:val="Hyperlink"/>
@@ -437,11 +437,11 @@
           <w:numId w:val="1001"/>
         </w:numPr>
       </w:pPr>
-      <w:hyperlink r:id="rId43"/>
+      <w:hyperlink r:id="rId45"/>
       <w:r>
         <w:t xml:space="preserve"> </w:t>
       </w:r>
-      <w:hyperlink r:id="rId44">
+      <w:hyperlink r:id="rId46">
         <w:r>
           <w:rPr>
             <w:rStyle w:val="Hyperlink"/>
@@ -458,14 +458,14 @@
         <w:t xml:space="preserve">Esperamos que encuentres estas publicaciones igualmente interesantes y útiles. ¡Disfruta de la lectura!</w:t>
       </w:r>
     </w:p>
-    <w:bookmarkEnd w:id="45"/>
+    <w:bookmarkEnd w:id="47"/>
     <w:sectPr>
-      <w:headerReference r:id="rId9" w:type="even"/>
-      <w:headerReference r:id="rId11" w:type="default"/>
-      <w:footerReference r:id="rId14" w:type="even"/>
-      <w:footerReference r:id="rId13" w:type="default"/>
-      <w:headerReference r:id="rId10" w:type="first"/>
-      <w:footerReference r:id="rId12" w:type="first"/>
+      <w:headerReference r:id="rId8" w:type="even"/>
+      <w:headerReference r:id="rId9" w:type="default"/>
+      <w:footerReference r:id="rId10" w:type="even"/>
+      <w:footerReference r:id="rId11" w:type="default"/>
+      <w:headerReference r:id="rId12" w:type="first"/>
+      <w:footerReference r:id="rId13" w:type="first"/>
       <w:pgSz w:h="15840" w:w="12240"/>
       <w:pgMar w:bottom="1440" w:footer="720" w:gutter="0" w:header="720" w:left="1440" w:right="1440" w:top="1440"/>
       <w:cols w:space="720"/>

</xml_diff>